<commit_message>
Corrected HW Task1 DWH_PG module
</commit_message>
<xml_diff>
--- a/DWH_2_Task_1/DWH_2_Task_1.docx
+++ b/DWH_2_Task_1/DWH_2_Task_1.docx
@@ -149,7 +149,8 @@
       <w:proofErr w:type="spellEnd"/>
       <w:r>
         <w:rPr>
-          <w:lang w:val="uk-UA"/>
+          <w:noProof/>
+          <w:lang w:eastAsia="ru-RU"/>
         </w:rPr>
         <w:drawing>
           <wp:inline distT="0" distB="0" distL="0" distR="0" wp14:anchorId="39272893" wp14:editId="5292B88A">
@@ -309,7 +310,8 @@
       </w:pPr>
       <w:r>
         <w:rPr>
-          <w:lang w:val="en-GB"/>
+          <w:noProof/>
+          <w:lang w:eastAsia="ru-RU"/>
         </w:rPr>
         <w:drawing>
           <wp:inline distT="0" distB="0" distL="0" distR="0" wp14:anchorId="258A36FC" wp14:editId="274443BE">
@@ -409,7 +411,8 @@
       </w:pPr>
       <w:r>
         <w:rPr>
-          <w:lang w:val="en-GB"/>
+          <w:noProof/>
+          <w:lang w:eastAsia="ru-RU"/>
         </w:rPr>
         <w:drawing>
           <wp:inline distT="0" distB="0" distL="0" distR="0" wp14:anchorId="795A9933" wp14:editId="69DA8360">
@@ -459,164 +462,11 @@
           <w:lang w:val="en-GB"/>
         </w:rPr>
         <w:lastRenderedPageBreak/>
-        <w:t xml:space="preserve">This task shows how to create and manage tablespaces in PostgreSQL. A new tablespace </w:t>
-      </w:r>
-      <w:proofErr w:type="gramStart"/>
-      <w:r>
-        <w:rPr>
-          <w:lang w:val="en-GB"/>
-        </w:rPr>
-        <w:t>is created at the operating system level and registered in PostgreSQL</w:t>
-      </w:r>
-      <w:proofErr w:type="gramEnd"/>
-      <w:r>
-        <w:rPr>
-          <w:lang w:val="en-GB"/>
-        </w:rPr>
-        <w:t xml:space="preserve">. The database </w:t>
-      </w:r>
-      <w:proofErr w:type="spellStart"/>
-      <w:r>
-        <w:rPr>
-          <w:rStyle w:val="HTML"/>
-          <w:rFonts w:eastAsiaTheme="minorHAnsi"/>
-          <w:lang w:val="en-GB"/>
-        </w:rPr>
-        <w:t>test_db</w:t>
-      </w:r>
-      <w:proofErr w:type="spellEnd"/>
-      <w:r>
-        <w:rPr>
-          <w:lang w:val="en-GB"/>
-        </w:rPr>
-        <w:t xml:space="preserve"> </w:t>
-      </w:r>
-      <w:proofErr w:type="gramStart"/>
-      <w:r>
-        <w:rPr>
-          <w:lang w:val="en-GB"/>
-        </w:rPr>
-        <w:t>is then moved</w:t>
-      </w:r>
-      <w:proofErr w:type="gramEnd"/>
-      <w:r>
-        <w:rPr>
-          <w:lang w:val="en-GB"/>
-        </w:rPr>
-        <w:t xml:space="preserve"> to this tablespace, demonstrating how PostgreSQL separates logical database objects from their physical storage on disk.</w:t>
-      </w:r>
-    </w:p>
-    <w:p>
-      <w:pPr>
-        <w:rPr>
-          <w:lang w:val="en-GB"/>
-        </w:rPr>
-      </w:pPr>
-    </w:p>
-    <w:p>
-      <w:pPr>
-        <w:rPr>
-          <w:lang w:val="en-GB"/>
-        </w:rPr>
-      </w:pPr>
-      <w:r>
-        <w:rPr>
-          <w:lang w:val="en-GB"/>
-        </w:rPr>
-        <w:t xml:space="preserve">TASK 3 CREATE NEW SCHEMA </w:t>
-      </w:r>
-    </w:p>
-    <w:p>
-      <w:pPr>
-        <w:rPr>
-          <w:lang w:val="en-GB"/>
-        </w:rPr>
-      </w:pPr>
-    </w:p>
-    <w:p>
-      <w:pPr>
-        <w:rPr>
-          <w:lang w:val="en-GB"/>
-        </w:rPr>
-      </w:pPr>
-      <w:r>
-        <w:rPr>
-          <w:lang w:val="en-GB"/>
-        </w:rPr>
-        <w:t xml:space="preserve">Check the table: SELECT </w:t>
-      </w:r>
-      <w:proofErr w:type="spellStart"/>
-      <w:r>
-        <w:rPr>
-          <w:lang w:val="en-GB"/>
-        </w:rPr>
-        <w:t>schemaname</w:t>
-      </w:r>
-      <w:proofErr w:type="spellEnd"/>
-      <w:r>
-        <w:rPr>
-          <w:lang w:val="en-GB"/>
-        </w:rPr>
-        <w:t xml:space="preserve">, </w:t>
-      </w:r>
-      <w:proofErr w:type="spellStart"/>
-      <w:r>
-        <w:rPr>
-          <w:lang w:val="en-GB"/>
-        </w:rPr>
-        <w:t>tablename</w:t>
-      </w:r>
-      <w:proofErr w:type="spellEnd"/>
-      <w:r>
-        <w:rPr>
-          <w:lang w:val="en-GB"/>
-        </w:rPr>
-        <w:t xml:space="preserve"> FROM </w:t>
-      </w:r>
-      <w:proofErr w:type="spellStart"/>
-      <w:r>
-        <w:rPr>
-          <w:lang w:val="en-GB"/>
-        </w:rPr>
-        <w:t>pg_tables</w:t>
-      </w:r>
-      <w:proofErr w:type="spellEnd"/>
-      <w:r>
-        <w:rPr>
-          <w:lang w:val="en-GB"/>
-        </w:rPr>
-        <w:t xml:space="preserve"> WHERE </w:t>
-      </w:r>
-      <w:proofErr w:type="spellStart"/>
-      <w:r>
-        <w:rPr>
-          <w:lang w:val="en-GB"/>
-        </w:rPr>
-        <w:t>tablename</w:t>
-      </w:r>
-      <w:proofErr w:type="spellEnd"/>
-      <w:r>
-        <w:rPr>
-          <w:lang w:val="en-GB"/>
-        </w:rPr>
-        <w:t xml:space="preserve"> = 'person';</w:t>
-      </w:r>
-    </w:p>
-    <w:p>
-      <w:pPr>
-        <w:rPr>
-          <w:lang w:val="en-GB"/>
-        </w:rPr>
-      </w:pPr>
-      <w:r>
-        <w:rPr>
-          <w:lang w:val="en-GB"/>
-        </w:rPr>
         <w:drawing>
-          <wp:inline distT="0" distB="0" distL="0" distR="0" wp14:anchorId="08241707" wp14:editId="62FDACD2">
-            <wp:extent cx="4153480" cy="1019317"/>
+          <wp:inline distT="0" distB="0" distL="0" distR="0" wp14:anchorId="72A297BB" wp14:editId="24CB9183">
+            <wp:extent cx="3886742" cy="3534268"/>
             <wp:effectExtent l="0" t="0" r="0" b="9525"/>
-            <wp:docPr id="3" name="Рисунок 3"/>
+            <wp:docPr id="13" name="Рисунок 13"/>
             <wp:cNvGraphicFramePr>
               <a:graphicFrameLocks xmlns:a="http://schemas.openxmlformats.org/drawingml/2006/main" noChangeAspect="1"/>
             </wp:cNvGraphicFramePr>
@@ -636,7 +486,7 @@
                   <pic:spPr>
                     <a:xfrm>
                       <a:off x="0" y="0"/>
-                      <a:ext cx="4153480" cy="1019317"/>
+                      <a:ext cx="3886742" cy="3534268"/>
                     </a:xfrm>
                     <a:prstGeom prst="rect">
                       <a:avLst/>
@@ -659,79 +509,165 @@
         <w:rPr>
           <w:lang w:val="en-GB"/>
         </w:rPr>
-        <w:t xml:space="preserve">3. Insert into person table values (correct queries if needed): INSERT INTO person </w:t>
+        <w:t xml:space="preserve">This task shows how to create and manage tablespaces in PostgreSQL. A new tablespace </w:t>
       </w:r>
       <w:proofErr w:type="gramStart"/>
       <w:r>
         <w:rPr>
           <w:lang w:val="en-GB"/>
         </w:rPr>
-        <w:t>VALUES(</w:t>
+        <w:t>is created at the operating system level and registered in PostgreSQL</w:t>
       </w:r>
       <w:proofErr w:type="gramEnd"/>
       <w:r>
         <w:rPr>
           <w:lang w:val="en-GB"/>
         </w:rPr>
-        <w:t>1, 'Bob'); INSERT INTO person VALUES(2, 'Alice'); INSERT INTO person VALUES(3, 'Robert');</w:t>
-      </w:r>
-    </w:p>
-    <w:p>
-      <w:pPr>
-        <w:rPr>
-          <w:lang w:val="en-GB"/>
-        </w:rPr>
-      </w:pPr>
-      <w:r>
-        <w:rPr>
-          <w:lang w:val="en-GB"/>
-        </w:rPr>
-        <w:t xml:space="preserve"> 4. Use SHOW </w:t>
-      </w:r>
-      <w:proofErr w:type="spellStart"/>
-      <w:r>
-        <w:rPr>
-          <w:lang w:val="en-GB"/>
-        </w:rPr>
-        <w:t>search_path</w:t>
-      </w:r>
-      <w:proofErr w:type="spellEnd"/>
-      <w:r>
-        <w:rPr>
-          <w:lang w:val="en-GB"/>
-        </w:rPr>
-        <w:t xml:space="preserve"> and SET </w:t>
-      </w:r>
-      <w:proofErr w:type="spellStart"/>
-      <w:r>
-        <w:rPr>
-          <w:lang w:val="en-GB"/>
-        </w:rPr>
-        <w:t>search_path</w:t>
-      </w:r>
-      <w:proofErr w:type="spellEnd"/>
-      <w:r>
-        <w:rPr>
-          <w:lang w:val="en-GB"/>
-        </w:rPr>
-        <w:t xml:space="preserve"> to perform INSERTS from previous task without any correction.</w:t>
-      </w:r>
-    </w:p>
-    <w:p>
-      <w:pPr>
-        <w:rPr>
-          <w:lang w:val="en-GB"/>
-        </w:rPr>
-      </w:pPr>
-      <w:r>
-        <w:rPr>
-          <w:lang w:val="en-GB"/>
+        <w:t xml:space="preserve">. The database </w:t>
+      </w:r>
+      <w:proofErr w:type="spellStart"/>
+      <w:r>
+        <w:rPr>
+          <w:rStyle w:val="HTML"/>
+          <w:rFonts w:eastAsiaTheme="minorHAnsi"/>
+          <w:lang w:val="en-GB"/>
+        </w:rPr>
+        <w:t>test_db</w:t>
+      </w:r>
+      <w:proofErr w:type="spellEnd"/>
+      <w:r>
+        <w:rPr>
+          <w:lang w:val="en-GB"/>
+        </w:rPr>
+        <w:t xml:space="preserve"> </w:t>
+      </w:r>
+      <w:proofErr w:type="gramStart"/>
+      <w:r>
+        <w:rPr>
+          <w:lang w:val="en-GB"/>
+        </w:rPr>
+        <w:t>is then moved</w:t>
+      </w:r>
+      <w:proofErr w:type="gramEnd"/>
+      <w:r>
+        <w:rPr>
+          <w:lang w:val="en-GB"/>
+        </w:rPr>
+        <w:t xml:space="preserve"> to this tablespace, demonstrating how PostgreSQL separates logical database objects from their physical storage on disk.</w:t>
+      </w:r>
+    </w:p>
+    <w:p>
+      <w:pPr>
+        <w:rPr>
+          <w:lang w:val="en-GB"/>
+        </w:rPr>
+      </w:pPr>
+    </w:p>
+    <w:p>
+      <w:pPr>
+        <w:rPr>
+          <w:lang w:val="en-GB"/>
+        </w:rPr>
+      </w:pPr>
+      <w:r>
+        <w:rPr>
+          <w:lang w:val="en-GB"/>
+        </w:rPr>
+        <w:t xml:space="preserve">TASK 3 CREATE NEW SCHEMA </w:t>
+      </w:r>
+    </w:p>
+    <w:p>
+      <w:pPr>
+        <w:rPr>
+          <w:lang w:val="en-GB"/>
+        </w:rPr>
+      </w:pPr>
+    </w:p>
+    <w:p>
+      <w:pPr>
+        <w:rPr>
+          <w:lang w:val="en-GB"/>
+        </w:rPr>
+      </w:pPr>
+      <w:r>
+        <w:rPr>
+          <w:lang w:val="en-GB"/>
+        </w:rPr>
+        <w:t xml:space="preserve">Check the table: SELECT </w:t>
+      </w:r>
+      <w:proofErr w:type="spellStart"/>
+      <w:r>
+        <w:rPr>
+          <w:lang w:val="en-GB"/>
+        </w:rPr>
+        <w:t>schemaname</w:t>
+      </w:r>
+      <w:proofErr w:type="spellEnd"/>
+      <w:r>
+        <w:rPr>
+          <w:lang w:val="en-GB"/>
+        </w:rPr>
+        <w:t xml:space="preserve">, </w:t>
+      </w:r>
+      <w:proofErr w:type="spellStart"/>
+      <w:r>
+        <w:rPr>
+          <w:lang w:val="en-GB"/>
+        </w:rPr>
+        <w:t>tablename</w:t>
+      </w:r>
+      <w:proofErr w:type="spellEnd"/>
+      <w:r>
+        <w:rPr>
+          <w:lang w:val="en-GB"/>
+        </w:rPr>
+        <w:t xml:space="preserve"> FROM </w:t>
+      </w:r>
+      <w:proofErr w:type="spellStart"/>
+      <w:r>
+        <w:rPr>
+          <w:lang w:val="en-GB"/>
+        </w:rPr>
+        <w:t>pg_tables</w:t>
+      </w:r>
+      <w:proofErr w:type="spellEnd"/>
+      <w:r>
+        <w:rPr>
+          <w:lang w:val="en-GB"/>
+        </w:rPr>
+        <w:t xml:space="preserve"> WHERE </w:t>
+      </w:r>
+      <w:proofErr w:type="spellStart"/>
+      <w:r>
+        <w:rPr>
+          <w:lang w:val="en-GB"/>
+        </w:rPr>
+        <w:t>tablename</w:t>
+      </w:r>
+      <w:proofErr w:type="spellEnd"/>
+      <w:r>
+        <w:rPr>
+          <w:lang w:val="en-GB"/>
+        </w:rPr>
+        <w:t xml:space="preserve"> = 'person';</w:t>
+      </w:r>
+    </w:p>
+    <w:p>
+      <w:pPr>
+        <w:rPr>
+          <w:lang w:val="en-GB"/>
+        </w:rPr>
+      </w:pPr>
+      <w:r>
+        <w:rPr>
+          <w:noProof/>
+          <w:lang w:eastAsia="ru-RU"/>
         </w:rPr>
         <w:drawing>
-          <wp:inline distT="0" distB="0" distL="0" distR="0" wp14:anchorId="70616C86" wp14:editId="545CF85B">
-            <wp:extent cx="2181529" cy="1038370"/>
+          <wp:inline distT="0" distB="0" distL="0" distR="0" wp14:anchorId="08241707" wp14:editId="62FDACD2">
+            <wp:extent cx="4153480" cy="1019317"/>
             <wp:effectExtent l="0" t="0" r="0" b="9525"/>
-            <wp:docPr id="4" name="Рисунок 4"/>
+            <wp:docPr id="3" name="Рисунок 3"/>
             <wp:cNvGraphicFramePr>
               <a:graphicFrameLocks xmlns:a="http://schemas.openxmlformats.org/drawingml/2006/main" noChangeAspect="1"/>
             </wp:cNvGraphicFramePr>
@@ -751,7 +687,7 @@
                   <pic:spPr>
                     <a:xfrm>
                       <a:off x="0" y="0"/>
-                      <a:ext cx="2181529" cy="1038370"/>
+                      <a:ext cx="4153480" cy="1019317"/>
                     </a:xfrm>
                     <a:prstGeom prst="rect">
                       <a:avLst/>
@@ -774,11 +710,80 @@
         <w:rPr>
           <w:lang w:val="en-GB"/>
         </w:rPr>
+        <w:t xml:space="preserve">3. Insert into person table values (correct queries if needed): INSERT INTO person </w:t>
+      </w:r>
+      <w:proofErr w:type="gramStart"/>
+      <w:r>
+        <w:rPr>
+          <w:lang w:val="en-GB"/>
+        </w:rPr>
+        <w:t>VALUES(</w:t>
+      </w:r>
+      <w:proofErr w:type="gramEnd"/>
+      <w:r>
+        <w:rPr>
+          <w:lang w:val="en-GB"/>
+        </w:rPr>
+        <w:t>1, 'Bob'); INSERT INTO person VALUES(2, 'Alice'); INSERT INTO person VALUES(3, 'Robert');</w:t>
+      </w:r>
+    </w:p>
+    <w:p>
+      <w:pPr>
+        <w:rPr>
+          <w:lang w:val="en-GB"/>
+        </w:rPr>
+      </w:pPr>
+      <w:r>
+        <w:rPr>
+          <w:lang w:val="en-GB"/>
+        </w:rPr>
+        <w:t xml:space="preserve"> 4. Use SHOW </w:t>
+      </w:r>
+      <w:proofErr w:type="spellStart"/>
+      <w:r>
+        <w:rPr>
+          <w:lang w:val="en-GB"/>
+        </w:rPr>
+        <w:t>search_path</w:t>
+      </w:r>
+      <w:proofErr w:type="spellEnd"/>
+      <w:r>
+        <w:rPr>
+          <w:lang w:val="en-GB"/>
+        </w:rPr>
+        <w:t xml:space="preserve"> and SET </w:t>
+      </w:r>
+      <w:proofErr w:type="spellStart"/>
+      <w:r>
+        <w:rPr>
+          <w:lang w:val="en-GB"/>
+        </w:rPr>
+        <w:t>search_path</w:t>
+      </w:r>
+      <w:proofErr w:type="spellEnd"/>
+      <w:r>
+        <w:rPr>
+          <w:lang w:val="en-GB"/>
+        </w:rPr>
+        <w:t xml:space="preserve"> to perform INSERTS from previous task without any correction.</w:t>
+      </w:r>
+    </w:p>
+    <w:p>
+      <w:pPr>
+        <w:rPr>
+          <w:lang w:val="en-GB"/>
+        </w:rPr>
+      </w:pPr>
+      <w:r>
+        <w:rPr>
+          <w:noProof/>
+          <w:lang w:eastAsia="ru-RU"/>
+        </w:rPr>
         <w:drawing>
-          <wp:inline distT="0" distB="0" distL="0" distR="0" wp14:anchorId="7FF575CC" wp14:editId="59E33D28">
-            <wp:extent cx="3477110" cy="3620005"/>
-            <wp:effectExtent l="0" t="0" r="9525" b="0"/>
-            <wp:docPr id="6" name="Рисунок 6"/>
+          <wp:inline distT="0" distB="0" distL="0" distR="0" wp14:anchorId="70616C86" wp14:editId="545CF85B">
+            <wp:extent cx="2181529" cy="1038370"/>
+            <wp:effectExtent l="0" t="0" r="0" b="9525"/>
+            <wp:docPr id="4" name="Рисунок 4"/>
             <wp:cNvGraphicFramePr>
               <a:graphicFrameLocks xmlns:a="http://schemas.openxmlformats.org/drawingml/2006/main" noChangeAspect="1"/>
             </wp:cNvGraphicFramePr>
@@ -798,7 +803,7 @@
                   <pic:spPr>
                     <a:xfrm>
                       <a:off x="0" y="0"/>
-                      <a:ext cx="3477110" cy="3620005"/>
+                      <a:ext cx="2181529" cy="1038370"/>
                     </a:xfrm>
                     <a:prstGeom prst="rect">
                       <a:avLst/>
@@ -819,98 +824,15 @@
       </w:pPr>
       <w:r>
         <w:rPr>
-          <w:lang w:val="en-GB"/>
+          <w:noProof/>
+          <w:lang w:eastAsia="ru-RU"/>
         </w:rPr>
         <w:lastRenderedPageBreak/>
-        <w:t xml:space="preserve">This task demonstrates schema usage for logical object organization inside a database. A new schema </w:t>
-      </w:r>
-      <w:proofErr w:type="gramStart"/>
-      <w:r>
-        <w:rPr>
-          <w:rStyle w:val="HTML"/>
-          <w:rFonts w:eastAsiaTheme="minorHAnsi"/>
-          <w:lang w:val="en-GB"/>
-        </w:rPr>
-        <w:t>labs</w:t>
-      </w:r>
-      <w:proofErr w:type="gramEnd"/>
-      <w:r>
-        <w:rPr>
-          <w:lang w:val="en-GB"/>
-        </w:rPr>
-        <w:t xml:space="preserve"> is created, and a table </w:t>
-      </w:r>
-      <w:r>
-        <w:rPr>
-          <w:rStyle w:val="HTML"/>
-          <w:rFonts w:eastAsiaTheme="minorHAnsi"/>
-          <w:lang w:val="en-GB"/>
-        </w:rPr>
-        <w:t>person</w:t>
-      </w:r>
-      <w:r>
-        <w:rPr>
-          <w:lang w:val="en-GB"/>
-        </w:rPr>
-        <w:t xml:space="preserve"> is added to it. The task also shows how the </w:t>
-      </w:r>
-      <w:proofErr w:type="spellStart"/>
-      <w:r>
-        <w:rPr>
-          <w:rStyle w:val="HTML"/>
-          <w:rFonts w:eastAsiaTheme="minorHAnsi"/>
-          <w:lang w:val="en-GB"/>
-        </w:rPr>
-        <w:t>search_path</w:t>
-      </w:r>
-      <w:proofErr w:type="spellEnd"/>
-      <w:r>
-        <w:rPr>
-          <w:lang w:val="en-GB"/>
-        </w:rPr>
-        <w:t xml:space="preserve"> parameter affects object name resolution, allowing SQL statements to work without explicitly specifying schema names.</w:t>
-      </w:r>
-    </w:p>
-    <w:p>
-      <w:pPr>
-        <w:rPr>
-          <w:lang w:val="en-GB"/>
-        </w:rPr>
-      </w:pPr>
-    </w:p>
-    <w:p>
-      <w:r>
-        <w:t>3.1 TASK 4 INVESTIGATE MVCC*</w:t>
-      </w:r>
-    </w:p>
-    <w:p>
-      <w:pPr>
-        <w:rPr>
-          <w:lang w:val="en-GB"/>
-        </w:rPr>
-      </w:pPr>
-      <w:r>
-        <w:rPr>
-          <w:lang w:val="en-GB"/>
-        </w:rPr>
-        <w:t>Before transactions</w:t>
-      </w:r>
-    </w:p>
-    <w:p>
-      <w:pPr>
-        <w:rPr>
-          <w:lang w:val="en-GB"/>
-        </w:rPr>
-      </w:pPr>
-      <w:r>
-        <w:rPr>
-          <w:lang w:val="en-GB"/>
-        </w:rPr>
         <w:drawing>
-          <wp:inline distT="0" distB="0" distL="0" distR="0" wp14:anchorId="43139D49" wp14:editId="42C82512">
-            <wp:extent cx="5353797" cy="1867161"/>
-            <wp:effectExtent l="0" t="0" r="0" b="0"/>
-            <wp:docPr id="7" name="Рисунок 7"/>
+          <wp:inline distT="0" distB="0" distL="0" distR="0" wp14:anchorId="7FF575CC" wp14:editId="59E33D28">
+            <wp:extent cx="3477110" cy="3620005"/>
+            <wp:effectExtent l="0" t="0" r="9525" b="0"/>
+            <wp:docPr id="6" name="Рисунок 6"/>
             <wp:cNvGraphicFramePr>
               <a:graphicFrameLocks xmlns:a="http://schemas.openxmlformats.org/drawingml/2006/main" noChangeAspect="1"/>
             </wp:cNvGraphicFramePr>
@@ -930,7 +852,7 @@
                   <pic:spPr>
                     <a:xfrm>
                       <a:off x="0" y="0"/>
-                      <a:ext cx="5353797" cy="1867161"/>
+                      <a:ext cx="3477110" cy="3620005"/>
                     </a:xfrm>
                     <a:prstGeom prst="rect">
                       <a:avLst/>
@@ -946,18 +868,81 @@
     <w:p>
       <w:pPr>
         <w:rPr>
-          <w:lang w:val="uk-UA"/>
-        </w:rPr>
-      </w:pPr>
-      <w:r>
-        <w:rPr>
-          <w:lang w:val="en-GB"/>
-        </w:rPr>
+          <w:lang w:val="en-GB"/>
+        </w:rPr>
+      </w:pPr>
+      <w:r>
+        <w:rPr>
+          <w:lang w:val="en-GB"/>
+        </w:rPr>
+        <w:t xml:space="preserve">This task demonstrates schema usage for logical object organization inside a database. A new schema </w:t>
+      </w:r>
+      <w:proofErr w:type="gramStart"/>
+      <w:r>
+        <w:rPr>
+          <w:rStyle w:val="HTML"/>
+          <w:rFonts w:eastAsiaTheme="minorHAnsi"/>
+          <w:lang w:val="en-GB"/>
+        </w:rPr>
+        <w:t>labs</w:t>
+      </w:r>
+      <w:proofErr w:type="gramEnd"/>
+      <w:r>
+        <w:rPr>
+          <w:lang w:val="en-GB"/>
+        </w:rPr>
+        <w:t xml:space="preserve"> is created, and a table </w:t>
+      </w:r>
+      <w:r>
+        <w:rPr>
+          <w:rStyle w:val="HTML"/>
+          <w:rFonts w:eastAsiaTheme="minorHAnsi"/>
+          <w:lang w:val="en-GB"/>
+        </w:rPr>
+        <w:t>person</w:t>
+      </w:r>
+      <w:r>
+        <w:rPr>
+          <w:lang w:val="en-GB"/>
+        </w:rPr>
+        <w:t xml:space="preserve"> is added to it. The task also shows how the </w:t>
+      </w:r>
+      <w:proofErr w:type="spellStart"/>
+      <w:r>
+        <w:rPr>
+          <w:rStyle w:val="HTML"/>
+          <w:rFonts w:eastAsiaTheme="minorHAnsi"/>
+          <w:lang w:val="en-GB"/>
+        </w:rPr>
+        <w:t>search_path</w:t>
+      </w:r>
+      <w:proofErr w:type="spellEnd"/>
+      <w:r>
+        <w:rPr>
+          <w:lang w:val="en-GB"/>
+        </w:rPr>
+        <w:t xml:space="preserve"> parameter affects object name resolution, allowing SQL statements to work without explicitly specifying schema names.</w:t>
+      </w:r>
+    </w:p>
+    <w:p>
+      <w:pPr>
+        <w:rPr>
+          <w:lang w:val="en-GB"/>
+        </w:rPr>
+      </w:pPr>
+    </w:p>
+    <w:p>
+      <w:r>
+        <w:t>3.1 TASK 4 INVESTIGATE MVCC*</w:t>
+      </w:r>
+    </w:p>
+    <w:p>
+      <w:r>
         <w:drawing>
-          <wp:inline distT="0" distB="0" distL="0" distR="0" wp14:anchorId="5DD02E54" wp14:editId="3D2DABEF">
-            <wp:extent cx="5563376" cy="1933845"/>
+          <wp:inline distT="0" distB="0" distL="0" distR="0" wp14:anchorId="364746B5" wp14:editId="4A123727">
+            <wp:extent cx="5639587" cy="1648055"/>
             <wp:effectExtent l="0" t="0" r="0" b="9525"/>
-            <wp:docPr id="8" name="Рисунок 8"/>
+            <wp:docPr id="14" name="Рисунок 14"/>
             <wp:cNvGraphicFramePr>
               <a:graphicFrameLocks xmlns:a="http://schemas.openxmlformats.org/drawingml/2006/main" noChangeAspect="1"/>
             </wp:cNvGraphicFramePr>
@@ -977,7 +962,7 @@
                   <pic:spPr>
                     <a:xfrm>
                       <a:off x="0" y="0"/>
-                      <a:ext cx="5563376" cy="1933845"/>
+                      <a:ext cx="5639587" cy="1648055"/>
                     </a:xfrm>
                     <a:prstGeom prst="rect">
                       <a:avLst/>
@@ -990,34 +975,36 @@
         </w:drawing>
       </w:r>
     </w:p>
-    <w:p>
-      <w:pPr>
-        <w:rPr>
-          <w:lang w:val="en-GB"/>
-        </w:rPr>
-      </w:pPr>
-      <w:r>
-        <w:rPr>
-          <w:lang w:val="en-GB"/>
-        </w:rPr>
-        <w:t>After the last transaction</w:t>
-      </w:r>
-    </w:p>
-    <w:p>
-      <w:pPr>
-        <w:rPr>
-          <w:lang w:val="en-GB"/>
-        </w:rPr>
-      </w:pPr>
-      <w:r>
-        <w:rPr>
-          <w:lang w:val="en-GB"/>
-        </w:rPr>
+    <w:p/>
+    <w:p>
+      <w:pPr>
+        <w:rPr>
+          <w:lang w:val="en-GB"/>
+        </w:rPr>
+      </w:pPr>
+      <w:r>
+        <w:rPr>
+          <w:lang w:val="en-GB"/>
+        </w:rPr>
+        <w:t>Before transactions</w:t>
+      </w:r>
+    </w:p>
+    <w:p>
+      <w:pPr>
+        <w:rPr>
+          <w:lang w:val="en-GB"/>
+        </w:rPr>
+      </w:pPr>
+      <w:r>
+        <w:rPr>
+          <w:lang w:val="en-GB"/>
+        </w:rPr>
+        <w:lastRenderedPageBreak/>
         <w:drawing>
-          <wp:inline distT="0" distB="0" distL="0" distR="0" wp14:anchorId="0315F6ED" wp14:editId="52D20160">
-            <wp:extent cx="5430008" cy="1905266"/>
-            <wp:effectExtent l="0" t="0" r="0" b="0"/>
-            <wp:docPr id="10" name="Рисунок 10"/>
+          <wp:inline distT="0" distB="0" distL="0" distR="0" wp14:anchorId="580444AE" wp14:editId="142363A9">
+            <wp:extent cx="5731510" cy="2212340"/>
+            <wp:effectExtent l="0" t="0" r="2540" b="0"/>
+            <wp:docPr id="16" name="Рисунок 16"/>
             <wp:cNvGraphicFramePr>
               <a:graphicFrameLocks xmlns:a="http://schemas.openxmlformats.org/drawingml/2006/main" noChangeAspect="1"/>
             </wp:cNvGraphicFramePr>
@@ -1037,7 +1024,7 @@
                   <pic:spPr>
                     <a:xfrm>
                       <a:off x="0" y="0"/>
-                      <a:ext cx="5430008" cy="1905266"/>
+                      <a:ext cx="5731510" cy="2212340"/>
                     </a:xfrm>
                     <a:prstGeom prst="rect">
                       <a:avLst/>
@@ -1060,12 +1047,11 @@
         <w:rPr>
           <w:lang w:val="en-GB"/>
         </w:rPr>
-        <w:lastRenderedPageBreak/>
         <w:drawing>
-          <wp:inline distT="0" distB="0" distL="0" distR="0" wp14:anchorId="5BB07F63" wp14:editId="1D992E5B">
-            <wp:extent cx="5306165" cy="2572109"/>
-            <wp:effectExtent l="0" t="0" r="0" b="0"/>
-            <wp:docPr id="9" name="Рисунок 9"/>
+          <wp:inline distT="0" distB="0" distL="0" distR="0" wp14:anchorId="52994A2C" wp14:editId="306D7FA5">
+            <wp:extent cx="5731510" cy="1871345"/>
+            <wp:effectExtent l="0" t="0" r="2540" b="0"/>
+            <wp:docPr id="17" name="Рисунок 17"/>
             <wp:cNvGraphicFramePr>
               <a:graphicFrameLocks xmlns:a="http://schemas.openxmlformats.org/drawingml/2006/main" noChangeAspect="1"/>
             </wp:cNvGraphicFramePr>
@@ -1085,7 +1071,7 @@
                   <pic:spPr>
                     <a:xfrm>
                       <a:off x="0" y="0"/>
-                      <a:ext cx="5306165" cy="2572109"/>
+                      <a:ext cx="5731510" cy="1871345"/>
                     </a:xfrm>
                     <a:prstGeom prst="rect">
                       <a:avLst/>
@@ -1101,131 +1087,7 @@
     <w:p>
       <w:pPr>
         <w:rPr>
-          <w:lang w:val="en-GB"/>
-        </w:rPr>
-      </w:pPr>
-      <w:r>
-        <w:rPr>
-          <w:lang w:val="en-GB"/>
-        </w:rPr>
-        <w:t xml:space="preserve">This task demonstrates how PostgreSQL implements MVCC internally. By </w:t>
-      </w:r>
-      <w:proofErr w:type="spellStart"/>
-      <w:r>
-        <w:rPr>
-          <w:lang w:val="en-GB"/>
-        </w:rPr>
-        <w:t>analyzing</w:t>
-      </w:r>
-      <w:proofErr w:type="spellEnd"/>
-      <w:r>
-        <w:rPr>
-          <w:lang w:val="en-GB"/>
-        </w:rPr>
-        <w:t xml:space="preserve"> system columns (</w:t>
-      </w:r>
-      <w:proofErr w:type="spellStart"/>
-      <w:r>
-        <w:rPr>
-          <w:rStyle w:val="HTML"/>
-          <w:rFonts w:eastAsiaTheme="minorHAnsi"/>
-          <w:lang w:val="en-GB"/>
-        </w:rPr>
-        <w:t>xmin</w:t>
-      </w:r>
-      <w:proofErr w:type="spellEnd"/>
-      <w:r>
-        <w:rPr>
-          <w:lang w:val="en-GB"/>
-        </w:rPr>
-        <w:t xml:space="preserve">, </w:t>
-      </w:r>
-      <w:proofErr w:type="spellStart"/>
-      <w:r>
-        <w:rPr>
-          <w:rStyle w:val="HTML"/>
-          <w:rFonts w:eastAsiaTheme="minorHAnsi"/>
-          <w:lang w:val="en-GB"/>
-        </w:rPr>
-        <w:t>xmax</w:t>
-      </w:r>
-      <w:proofErr w:type="spellEnd"/>
-      <w:r>
-        <w:rPr>
-          <w:lang w:val="en-GB"/>
-        </w:rPr>
-        <w:t xml:space="preserve">, </w:t>
-      </w:r>
-      <w:proofErr w:type="spellStart"/>
-      <w:r>
-        <w:rPr>
-          <w:rStyle w:val="HTML"/>
-          <w:rFonts w:eastAsiaTheme="minorHAnsi"/>
-          <w:lang w:val="en-GB"/>
-        </w:rPr>
-        <w:t>ctid</w:t>
-      </w:r>
-      <w:proofErr w:type="spellEnd"/>
-      <w:r>
-        <w:rPr>
-          <w:lang w:val="en-GB"/>
-        </w:rPr>
-        <w:t xml:space="preserve">) and using the </w:t>
-      </w:r>
-      <w:proofErr w:type="spellStart"/>
-      <w:r>
-        <w:rPr>
-          <w:rStyle w:val="HTML"/>
-          <w:rFonts w:eastAsiaTheme="minorHAnsi"/>
-          <w:lang w:val="en-GB"/>
-        </w:rPr>
-        <w:t>pageinspect</w:t>
-      </w:r>
-      <w:proofErr w:type="spellEnd"/>
-      <w:r>
-        <w:rPr>
-          <w:lang w:val="en-GB"/>
-        </w:rPr>
-        <w:t xml:space="preserve"> extension, we observe how INSERT, UPDATE, and DELETE operations create multiple tuple versions instead of modifying rows in place. This explains how PostgreSQL provides transaction isolation and visibility using snapshots.</w:t>
-      </w:r>
-    </w:p>
-    <w:p>
-      <w:pPr>
-        <w:rPr>
-          <w:lang w:val="en-GB"/>
-        </w:rPr>
-      </w:pPr>
-    </w:p>
-    <w:p>
-      <w:r>
-        <w:t>3.2 TASK 5 INVESTIGATE VACUUM</w:t>
-      </w:r>
-    </w:p>
-    <w:p>
-      <w:pPr>
-        <w:rPr>
-          <w:lang w:val="en-GB"/>
-        </w:rPr>
-      </w:pPr>
-      <w:r>
-        <w:rPr>
-          <w:lang w:val="en-GB"/>
-        </w:rPr>
-        <w:t xml:space="preserve">Vacuum </w:t>
-      </w:r>
-      <w:proofErr w:type="spellStart"/>
-      <w:r>
-        <w:rPr>
-          <w:lang w:val="en-GB"/>
-        </w:rPr>
-        <w:t>labs.person</w:t>
-      </w:r>
-      <w:proofErr w:type="spellEnd"/>
-    </w:p>
-    <w:p>
-      <w:pPr>
-        <w:rPr>
-          <w:lang w:val="en-GB"/>
+          <w:lang w:val="uk-UA"/>
         </w:rPr>
       </w:pPr>
       <w:r>
@@ -1233,10 +1095,10 @@
           <w:lang w:val="en-GB"/>
         </w:rPr>
         <w:drawing>
-          <wp:inline distT="0" distB="0" distL="0" distR="0" wp14:anchorId="7333A383" wp14:editId="7CF05F86">
-            <wp:extent cx="5325218" cy="2534004"/>
-            <wp:effectExtent l="0" t="0" r="0" b="0"/>
-            <wp:docPr id="11" name="Рисунок 11"/>
+          <wp:inline distT="0" distB="0" distL="0" distR="0" wp14:anchorId="30B7A313" wp14:editId="2BB4E99F">
+            <wp:extent cx="5731510" cy="1713865"/>
+            <wp:effectExtent l="0" t="0" r="2540" b="635"/>
+            <wp:docPr id="18" name="Рисунок 18"/>
             <wp:cNvGraphicFramePr>
               <a:graphicFrameLocks xmlns:a="http://schemas.openxmlformats.org/drawingml/2006/main" noChangeAspect="1"/>
             </wp:cNvGraphicFramePr>
@@ -1256,7 +1118,7 @@
                   <pic:spPr>
                     <a:xfrm>
                       <a:off x="0" y="0"/>
-                      <a:ext cx="5325218" cy="2534004"/>
+                      <a:ext cx="5731510" cy="1713865"/>
                     </a:xfrm>
                     <a:prstGeom prst="rect">
                       <a:avLst/>
@@ -1279,92 +1141,146 @@
     <w:p>
       <w:pPr>
         <w:rPr>
+          <w:lang w:val="en-GB"/>
+        </w:rPr>
+      </w:pPr>
+    </w:p>
+    <w:p>
+      <w:pPr>
+        <w:rPr>
+          <w:lang w:val="en-GB"/>
+        </w:rPr>
+      </w:pPr>
+      <w:r>
+        <w:rPr>
+          <w:lang w:val="en-GB"/>
+        </w:rPr>
+        <w:t xml:space="preserve">This task demonstrates how PostgreSQL implements MVCC internally. By </w:t>
+      </w:r>
+      <w:proofErr w:type="spellStart"/>
+      <w:r>
+        <w:rPr>
+          <w:lang w:val="en-GB"/>
+        </w:rPr>
+        <w:t>analyzing</w:t>
+      </w:r>
+      <w:proofErr w:type="spellEnd"/>
+      <w:r>
+        <w:rPr>
+          <w:lang w:val="en-GB"/>
+        </w:rPr>
+        <w:t xml:space="preserve"> system columns (</w:t>
+      </w:r>
+      <w:proofErr w:type="spellStart"/>
+      <w:r>
+        <w:rPr>
+          <w:rStyle w:val="HTML"/>
+          <w:rFonts w:eastAsiaTheme="minorHAnsi"/>
+          <w:lang w:val="en-GB"/>
+        </w:rPr>
+        <w:t>xmin</w:t>
+      </w:r>
+      <w:proofErr w:type="spellEnd"/>
+      <w:r>
+        <w:rPr>
+          <w:lang w:val="en-GB"/>
+        </w:rPr>
+        <w:t xml:space="preserve">, </w:t>
+      </w:r>
+      <w:proofErr w:type="spellStart"/>
+      <w:r>
+        <w:rPr>
+          <w:rStyle w:val="HTML"/>
+          <w:rFonts w:eastAsiaTheme="minorHAnsi"/>
+          <w:lang w:val="en-GB"/>
+        </w:rPr>
+        <w:t>xmax</w:t>
+      </w:r>
+      <w:proofErr w:type="spellEnd"/>
+      <w:r>
+        <w:rPr>
+          <w:lang w:val="en-GB"/>
+        </w:rPr>
+        <w:t xml:space="preserve">, </w:t>
+      </w:r>
+      <w:proofErr w:type="spellStart"/>
+      <w:r>
+        <w:rPr>
+          <w:rStyle w:val="HTML"/>
+          <w:rFonts w:eastAsiaTheme="minorHAnsi"/>
+          <w:lang w:val="en-GB"/>
+        </w:rPr>
+        <w:t>ctid</w:t>
+      </w:r>
+      <w:proofErr w:type="spellEnd"/>
+      <w:r>
+        <w:rPr>
+          <w:lang w:val="en-GB"/>
+        </w:rPr>
+        <w:t xml:space="preserve">) and using the </w:t>
+      </w:r>
+      <w:proofErr w:type="spellStart"/>
+      <w:r>
+        <w:rPr>
+          <w:rStyle w:val="HTML"/>
+          <w:rFonts w:eastAsiaTheme="minorHAnsi"/>
+          <w:lang w:val="en-GB"/>
+        </w:rPr>
+        <w:t>pageinspect</w:t>
+      </w:r>
+      <w:proofErr w:type="spellEnd"/>
+      <w:r>
+        <w:rPr>
+          <w:lang w:val="en-GB"/>
+        </w:rPr>
+        <w:t xml:space="preserve"> extension, we observe how INSERT, UPDATE, and DELETE operations create multiple tuple versions instead of modifying rows in place. This explains how PostgreSQL provides transaction isolation and visibility using snapshots.</w:t>
+      </w:r>
+    </w:p>
+    <w:p>
+      <w:pPr>
+        <w:rPr>
+          <w:lang w:val="en-GB"/>
+        </w:rPr>
+      </w:pPr>
+    </w:p>
+    <w:p>
+      <w:pPr>
+        <w:rPr>
+          <w:lang w:val="en-GB"/>
+        </w:rPr>
+      </w:pPr>
+      <w:r>
+        <w:rPr>
+          <w:lang w:val="en-GB"/>
+        </w:rPr>
+        <w:t>3.2 TASK 5 INVESTIGATE VACUUM</w:t>
+      </w:r>
+    </w:p>
+    <w:p>
+      <w:pPr>
+        <w:rPr>
+          <w:lang w:val="en-GB"/>
+        </w:rPr>
+      </w:pPr>
+      <w:r>
+        <w:rPr>
+          <w:lang w:val="en-GB"/>
+        </w:rPr>
+        <w:t xml:space="preserve">Vacuum </w:t>
+      </w:r>
+      <w:proofErr w:type="spellStart"/>
+      <w:r>
+        <w:rPr>
+          <w:lang w:val="en-GB"/>
+        </w:rPr>
+        <w:t>labs.person</w:t>
+      </w:r>
+      <w:proofErr w:type="spellEnd"/>
+    </w:p>
+    <w:p>
+      <w:pPr>
+        <w:rPr>
           <w:lang w:val="uk-UA"/>
-        </w:rPr>
-      </w:pPr>
-      <w:r>
-        <w:rPr>
-          <w:lang w:val="en-GB"/>
-        </w:rPr>
-        <w:t xml:space="preserve">After </w:t>
-      </w:r>
-      <w:r>
-        <w:rPr>
-          <w:rFonts w:ascii="Consolas" w:hAnsi="Consolas"/>
-          <w:b/>
-          <w:bCs/>
-          <w:color w:val="800000"/>
-          <w:sz w:val="16"/>
-          <w:szCs w:val="16"/>
-          <w:shd w:val="clear" w:color="auto" w:fill="FFFFFF"/>
-          <w:lang w:val="en-GB"/>
-        </w:rPr>
-        <w:t>vacuum</w:t>
-      </w:r>
-      <w:r>
-        <w:rPr>
-          <w:rFonts w:ascii="Consolas" w:hAnsi="Consolas"/>
-          <w:color w:val="000000"/>
-          <w:sz w:val="16"/>
-          <w:szCs w:val="16"/>
-          <w:shd w:val="clear" w:color="auto" w:fill="FFFFFF"/>
-          <w:lang w:val="en-GB"/>
-        </w:rPr>
-        <w:t xml:space="preserve"> </w:t>
-      </w:r>
-      <w:r>
-        <w:rPr>
-          <w:rFonts w:ascii="Consolas" w:hAnsi="Consolas"/>
-          <w:b/>
-          <w:bCs/>
-          <w:color w:val="800000"/>
-          <w:sz w:val="16"/>
-          <w:szCs w:val="16"/>
-          <w:shd w:val="clear" w:color="auto" w:fill="FFFFFF"/>
-          <w:lang w:val="en-GB"/>
-        </w:rPr>
-        <w:t>full</w:t>
-      </w:r>
-      <w:r>
-        <w:rPr>
-          <w:rFonts w:ascii="Consolas" w:hAnsi="Consolas"/>
-          <w:color w:val="000000"/>
-          <w:sz w:val="16"/>
-          <w:szCs w:val="16"/>
-          <w:shd w:val="clear" w:color="auto" w:fill="FFFFFF"/>
-          <w:lang w:val="en-GB"/>
-        </w:rPr>
-        <w:t xml:space="preserve"> </w:t>
-      </w:r>
-      <w:proofErr w:type="spellStart"/>
-      <w:r>
-        <w:rPr>
-          <w:rFonts w:ascii="Consolas" w:hAnsi="Consolas"/>
-          <w:color w:val="000000"/>
-          <w:sz w:val="16"/>
-          <w:szCs w:val="16"/>
-          <w:shd w:val="clear" w:color="auto" w:fill="FFFFFF"/>
-          <w:lang w:val="en-GB"/>
-        </w:rPr>
-        <w:t>labs.person</w:t>
-      </w:r>
-      <w:proofErr w:type="spellEnd"/>
-      <w:r>
-        <w:rPr>
-          <w:rFonts w:ascii="Consolas" w:hAnsi="Consolas"/>
-          <w:color w:val="FF0000"/>
-          <w:sz w:val="16"/>
-          <w:szCs w:val="16"/>
-          <w:shd w:val="clear" w:color="auto" w:fill="FFFFFF"/>
-          <w:lang w:val="en-GB"/>
-        </w:rPr>
-        <w:t>;</w:t>
-      </w:r>
-    </w:p>
-    <w:p>
-      <w:pPr>
-        <w:rPr>
-          <w:lang w:val="en-GB"/>
         </w:rPr>
       </w:pPr>
       <w:r>
@@ -1373,10 +1289,10 @@
         </w:rPr>
         <w:lastRenderedPageBreak/>
         <w:drawing>
-          <wp:inline distT="0" distB="0" distL="0" distR="0" wp14:anchorId="1D4AD763" wp14:editId="34E6A9BB">
-            <wp:extent cx="5306165" cy="2076740"/>
+          <wp:inline distT="0" distB="0" distL="0" distR="0" wp14:anchorId="2A191D38" wp14:editId="4FF89799">
+            <wp:extent cx="5410955" cy="2419688"/>
             <wp:effectExtent l="0" t="0" r="0" b="0"/>
-            <wp:docPr id="12" name="Рисунок 12"/>
+            <wp:docPr id="19" name="Рисунок 19"/>
             <wp:cNvGraphicFramePr>
               <a:graphicFrameLocks xmlns:a="http://schemas.openxmlformats.org/drawingml/2006/main" noChangeAspect="1"/>
             </wp:cNvGraphicFramePr>
@@ -1396,6 +1312,194 @@
                   <pic:spPr>
                     <a:xfrm>
                       <a:off x="0" y="0"/>
+                      <a:ext cx="5410955" cy="2419688"/>
+                    </a:xfrm>
+                    <a:prstGeom prst="rect">
+                      <a:avLst/>
+                    </a:prstGeom>
+                  </pic:spPr>
+                </pic:pic>
+              </a:graphicData>
+            </a:graphic>
+          </wp:inline>
+        </w:drawing>
+      </w:r>
+    </w:p>
+    <w:p>
+      <w:pPr>
+        <w:rPr>
+          <w:lang w:val="en-GB"/>
+        </w:rPr>
+      </w:pPr>
+      <w:r>
+        <w:rPr>
+          <w:noProof/>
+          <w:lang w:eastAsia="ru-RU"/>
+        </w:rPr>
+        <w:drawing>
+          <wp:inline distT="0" distB="0" distL="0" distR="0" wp14:anchorId="7333A383" wp14:editId="7CF05F86">
+            <wp:extent cx="5325218" cy="2534004"/>
+            <wp:effectExtent l="0" t="0" r="0" b="0"/>
+            <wp:docPr id="11" name="Рисунок 11"/>
+            <wp:cNvGraphicFramePr>
+              <a:graphicFrameLocks xmlns:a="http://schemas.openxmlformats.org/drawingml/2006/main" noChangeAspect="1"/>
+            </wp:cNvGraphicFramePr>
+            <a:graphic xmlns:a="http://schemas.openxmlformats.org/drawingml/2006/main">
+              <a:graphicData uri="http://schemas.openxmlformats.org/drawingml/2006/picture">
+                <pic:pic xmlns:pic="http://schemas.openxmlformats.org/drawingml/2006/picture">
+                  <pic:nvPicPr>
+                    <pic:cNvPr id="1" name=""/>
+                    <pic:cNvPicPr/>
+                  </pic:nvPicPr>
+                  <pic:blipFill>
+                    <a:blip r:embed="rId16"/>
+                    <a:stretch>
+                      <a:fillRect/>
+                    </a:stretch>
+                  </pic:blipFill>
+                  <pic:spPr>
+                    <a:xfrm>
+                      <a:off x="0" y="0"/>
+                      <a:ext cx="5325218" cy="2534004"/>
+                    </a:xfrm>
+                    <a:prstGeom prst="rect">
+                      <a:avLst/>
+                    </a:prstGeom>
+                  </pic:spPr>
+                </pic:pic>
+              </a:graphicData>
+            </a:graphic>
+          </wp:inline>
+        </w:drawing>
+      </w:r>
+    </w:p>
+    <w:p>
+      <w:pPr>
+        <w:rPr>
+          <w:lang w:val="en-GB"/>
+        </w:rPr>
+      </w:pPr>
+    </w:p>
+    <w:p>
+      <w:pPr>
+        <w:rPr>
+          <w:lang w:val="uk-UA"/>
+        </w:rPr>
+      </w:pPr>
+      <w:r>
+        <w:rPr>
+          <w:lang w:val="en-GB"/>
+        </w:rPr>
+        <w:t xml:space="preserve">After </w:t>
+      </w:r>
+      <w:r>
+        <w:rPr>
+          <w:rFonts w:ascii="Consolas" w:hAnsi="Consolas"/>
+          <w:b/>
+          <w:bCs/>
+          <w:color w:val="800000"/>
+          <w:sz w:val="16"/>
+          <w:szCs w:val="16"/>
+          <w:shd w:val="clear" w:color="auto" w:fill="FFFFFF"/>
+          <w:lang w:val="en-GB"/>
+        </w:rPr>
+        <w:t>vacuum</w:t>
+      </w:r>
+      <w:r>
+        <w:rPr>
+          <w:rFonts w:ascii="Consolas" w:hAnsi="Consolas"/>
+          <w:color w:val="000000"/>
+          <w:sz w:val="16"/>
+          <w:szCs w:val="16"/>
+          <w:shd w:val="clear" w:color="auto" w:fill="FFFFFF"/>
+          <w:lang w:val="en-GB"/>
+        </w:rPr>
+        <w:t xml:space="preserve"> </w:t>
+      </w:r>
+      <w:r>
+        <w:rPr>
+          <w:rFonts w:ascii="Consolas" w:hAnsi="Consolas"/>
+          <w:b/>
+          <w:bCs/>
+          <w:color w:val="800000"/>
+          <w:sz w:val="16"/>
+          <w:szCs w:val="16"/>
+          <w:shd w:val="clear" w:color="auto" w:fill="FFFFFF"/>
+          <w:lang w:val="en-GB"/>
+        </w:rPr>
+        <w:t>full</w:t>
+      </w:r>
+      <w:r>
+        <w:rPr>
+          <w:rFonts w:ascii="Consolas" w:hAnsi="Consolas"/>
+          <w:color w:val="000000"/>
+          <w:sz w:val="16"/>
+          <w:szCs w:val="16"/>
+          <w:shd w:val="clear" w:color="auto" w:fill="FFFFFF"/>
+          <w:lang w:val="en-GB"/>
+        </w:rPr>
+        <w:t xml:space="preserve"> </w:t>
+      </w:r>
+      <w:proofErr w:type="spellStart"/>
+      <w:r>
+        <w:rPr>
+          <w:rFonts w:ascii="Consolas" w:hAnsi="Consolas"/>
+          <w:color w:val="000000"/>
+          <w:sz w:val="16"/>
+          <w:szCs w:val="16"/>
+          <w:shd w:val="clear" w:color="auto" w:fill="FFFFFF"/>
+          <w:lang w:val="en-GB"/>
+        </w:rPr>
+        <w:t>labs.person</w:t>
+      </w:r>
+      <w:proofErr w:type="spellEnd"/>
+      <w:r>
+        <w:rPr>
+          <w:rFonts w:ascii="Consolas" w:hAnsi="Consolas"/>
+          <w:color w:val="FF0000"/>
+          <w:sz w:val="16"/>
+          <w:szCs w:val="16"/>
+          <w:shd w:val="clear" w:color="auto" w:fill="FFFFFF"/>
+          <w:lang w:val="en-GB"/>
+        </w:rPr>
+        <w:t>;</w:t>
+      </w:r>
+    </w:p>
+    <w:p>
+      <w:pPr>
+        <w:rPr>
+          <w:lang w:val="en-GB"/>
+        </w:rPr>
+      </w:pPr>
+      <w:r>
+        <w:rPr>
+          <w:noProof/>
+          <w:lang w:eastAsia="ru-RU"/>
+        </w:rPr>
+        <w:drawing>
+          <wp:inline distT="0" distB="0" distL="0" distR="0" wp14:anchorId="1D4AD763" wp14:editId="34E6A9BB">
+            <wp:extent cx="5306165" cy="2076740"/>
+            <wp:effectExtent l="0" t="0" r="0" b="0"/>
+            <wp:docPr id="12" name="Рисунок 12"/>
+            <wp:cNvGraphicFramePr>
+              <a:graphicFrameLocks xmlns:a="http://schemas.openxmlformats.org/drawingml/2006/main" noChangeAspect="1"/>
+            </wp:cNvGraphicFramePr>
+            <a:graphic xmlns:a="http://schemas.openxmlformats.org/drawingml/2006/main">
+              <a:graphicData uri="http://schemas.openxmlformats.org/drawingml/2006/picture">
+                <pic:pic xmlns:pic="http://schemas.openxmlformats.org/drawingml/2006/picture">
+                  <pic:nvPicPr>
+                    <pic:cNvPr id="1" name=""/>
+                    <pic:cNvPicPr/>
+                  </pic:nvPicPr>
+                  <pic:blipFill>
+                    <a:blip r:embed="rId17"/>
+                    <a:stretch>
+                      <a:fillRect/>
+                    </a:stretch>
+                  </pic:blipFill>
+                  <pic:spPr>
+                    <a:xfrm>
+                      <a:off x="0" y="0"/>
                       <a:ext cx="5306165" cy="2076740"/>
                     </a:xfrm>
                     <a:prstGeom prst="rect">
@@ -1411,95 +1515,469 @@
     </w:p>
     <w:p>
       <w:pPr>
-        <w:pStyle w:val="a3"/>
-        <w:rPr>
-          <w:lang w:val="en-GB"/>
-        </w:rPr>
-      </w:pPr>
-      <w:r>
-        <w:rPr>
-          <w:lang w:val="en-GB"/>
-        </w:rPr>
-        <w:t xml:space="preserve">This task shows the difference between </w:t>
-      </w:r>
-      <w:r>
-        <w:rPr>
-          <w:rStyle w:val="HTML"/>
-          <w:lang w:val="en-GB"/>
+        <w:spacing w:before="100" w:beforeAutospacing="1" w:after="100" w:afterAutospacing="1" w:line="240" w:lineRule="auto"/>
+        <w:rPr>
+          <w:rFonts w:ascii="Times New Roman" w:eastAsia="Times New Roman" w:hAnsi="Times New Roman" w:cs="Times New Roman"/>
+          <w:sz w:val="24"/>
+          <w:szCs w:val="24"/>
+          <w:lang w:val="en-GB" w:eastAsia="ru-RU"/>
+        </w:rPr>
+      </w:pPr>
+      <w:r>
+        <w:rPr>
+          <w:rFonts w:ascii="Times New Roman" w:eastAsia="Times New Roman" w:hAnsi="Times New Roman" w:cs="Times New Roman"/>
+          <w:sz w:val="24"/>
+          <w:szCs w:val="24"/>
+          <w:lang w:val="en-GB" w:eastAsia="ru-RU"/>
+        </w:rPr>
+        <w:t xml:space="preserve">This task demonstrates how PostgreSQL stores and manages tuples internally using MVCC (Multi-Version Concurrency Control). The query using </w:t>
+      </w:r>
+      <w:r>
+        <w:rPr>
+          <w:rFonts w:ascii="Courier New" w:eastAsia="Times New Roman" w:hAnsi="Courier New" w:cs="Courier New"/>
+          <w:sz w:val="20"/>
+          <w:szCs w:val="20"/>
+          <w:lang w:val="en-GB" w:eastAsia="ru-RU"/>
+        </w:rPr>
+        <w:t>heap_page_items</w:t>
+      </w:r>
+      <w:r>
+        <w:rPr>
+          <w:rFonts w:ascii="Times New Roman" w:eastAsia="Times New Roman" w:hAnsi="Times New Roman" w:cs="Times New Roman"/>
+          <w:sz w:val="24"/>
+          <w:szCs w:val="24"/>
+          <w:lang w:val="en-GB" w:eastAsia="ru-RU"/>
+        </w:rPr>
+        <w:t xml:space="preserve"> allows us to inspect the physical contents of a table page, including system columns such as </w:t>
+      </w:r>
+      <w:r>
+        <w:rPr>
+          <w:rFonts w:ascii="Courier New" w:eastAsia="Times New Roman" w:hAnsi="Courier New" w:cs="Courier New"/>
+          <w:sz w:val="20"/>
+          <w:szCs w:val="20"/>
+          <w:lang w:val="en-GB" w:eastAsia="ru-RU"/>
+        </w:rPr>
+        <w:t>t_xmin</w:t>
+      </w:r>
+      <w:r>
+        <w:rPr>
+          <w:rFonts w:ascii="Times New Roman" w:eastAsia="Times New Roman" w:hAnsi="Times New Roman" w:cs="Times New Roman"/>
+          <w:sz w:val="24"/>
+          <w:szCs w:val="24"/>
+          <w:lang w:val="en-GB" w:eastAsia="ru-RU"/>
+        </w:rPr>
+        <w:t xml:space="preserve"> (the </w:t>
+      </w:r>
+      <w:r>
+        <w:rPr>
+          <w:rFonts w:ascii="Times New Roman" w:eastAsia="Times New Roman" w:hAnsi="Times New Roman" w:cs="Times New Roman"/>
+          <w:sz w:val="24"/>
+          <w:szCs w:val="24"/>
+          <w:lang w:val="en-GB" w:eastAsia="ru-RU"/>
+        </w:rPr>
+        <w:lastRenderedPageBreak/>
+        <w:t xml:space="preserve">inserting transaction ID), </w:t>
+      </w:r>
+      <w:r>
+        <w:rPr>
+          <w:rFonts w:ascii="Courier New" w:eastAsia="Times New Roman" w:hAnsi="Courier New" w:cs="Courier New"/>
+          <w:sz w:val="20"/>
+          <w:szCs w:val="20"/>
+          <w:lang w:val="en-GB" w:eastAsia="ru-RU"/>
+        </w:rPr>
+        <w:t>t_xmax</w:t>
+      </w:r>
+      <w:r>
+        <w:rPr>
+          <w:rFonts w:ascii="Times New Roman" w:eastAsia="Times New Roman" w:hAnsi="Times New Roman" w:cs="Times New Roman"/>
+          <w:sz w:val="24"/>
+          <w:szCs w:val="24"/>
+          <w:lang w:val="en-GB" w:eastAsia="ru-RU"/>
+        </w:rPr>
+        <w:t xml:space="preserve"> (the deleting/updating transaction ID), and </w:t>
+      </w:r>
+      <w:r>
+        <w:rPr>
+          <w:rFonts w:ascii="Courier New" w:eastAsia="Times New Roman" w:hAnsi="Courier New" w:cs="Courier New"/>
+          <w:sz w:val="20"/>
+          <w:szCs w:val="20"/>
+          <w:lang w:val="en-GB" w:eastAsia="ru-RU"/>
+        </w:rPr>
+        <w:t>t_ctid</w:t>
+      </w:r>
+      <w:r>
+        <w:rPr>
+          <w:rFonts w:ascii="Times New Roman" w:eastAsia="Times New Roman" w:hAnsi="Times New Roman" w:cs="Times New Roman"/>
+          <w:sz w:val="24"/>
+          <w:szCs w:val="24"/>
+          <w:lang w:val="en-GB" w:eastAsia="ru-RU"/>
+        </w:rPr>
+        <w:t xml:space="preserve"> (the physical location of the tuple within the table file).</w:t>
+      </w:r>
+    </w:p>
+    <w:p>
+      <w:pPr>
+        <w:spacing w:before="100" w:beforeAutospacing="1" w:after="100" w:afterAutospacing="1" w:line="240" w:lineRule="auto"/>
+        <w:rPr>
+          <w:rFonts w:ascii="Times New Roman" w:eastAsia="Times New Roman" w:hAnsi="Times New Roman" w:cs="Times New Roman"/>
+          <w:sz w:val="24"/>
+          <w:szCs w:val="24"/>
+          <w:lang w:val="en-GB" w:eastAsia="ru-RU"/>
+        </w:rPr>
+      </w:pPr>
+      <w:r>
+        <w:rPr>
+          <w:rFonts w:ascii="Times New Roman" w:eastAsia="Times New Roman" w:hAnsi="Times New Roman" w:cs="Times New Roman"/>
+          <w:sz w:val="24"/>
+          <w:szCs w:val="24"/>
+          <w:lang w:val="en-GB" w:eastAsia="ru-RU"/>
+        </w:rPr>
+        <w:t xml:space="preserve">After running </w:t>
+      </w:r>
+      <w:r>
+        <w:rPr>
+          <w:rFonts w:ascii="Courier New" w:eastAsia="Times New Roman" w:hAnsi="Courier New" w:cs="Courier New"/>
+          <w:sz w:val="20"/>
+          <w:szCs w:val="20"/>
+          <w:lang w:val="en-GB" w:eastAsia="ru-RU"/>
+        </w:rPr>
+        <w:t>VACUUM labs.person</w:t>
+      </w:r>
+      <w:proofErr w:type="gramStart"/>
+      <w:r>
+        <w:rPr>
+          <w:rFonts w:ascii="Courier New" w:eastAsia="Times New Roman" w:hAnsi="Courier New" w:cs="Courier New"/>
+          <w:sz w:val="20"/>
+          <w:szCs w:val="20"/>
+          <w:lang w:val="en-GB" w:eastAsia="ru-RU"/>
+        </w:rPr>
+        <w:t>;</w:t>
+      </w:r>
+      <w:r>
+        <w:rPr>
+          <w:rFonts w:ascii="Times New Roman" w:eastAsia="Times New Roman" w:hAnsi="Times New Roman" w:cs="Times New Roman"/>
+          <w:sz w:val="24"/>
+          <w:szCs w:val="24"/>
+          <w:lang w:val="en-GB" w:eastAsia="ru-RU"/>
+        </w:rPr>
+        <w:t>,</w:t>
+      </w:r>
+      <w:proofErr w:type="gramEnd"/>
+      <w:r>
+        <w:rPr>
+          <w:rFonts w:ascii="Times New Roman" w:eastAsia="Times New Roman" w:hAnsi="Times New Roman" w:cs="Times New Roman"/>
+          <w:sz w:val="24"/>
+          <w:szCs w:val="24"/>
+          <w:lang w:val="en-GB" w:eastAsia="ru-RU"/>
+        </w:rPr>
+        <w:t xml:space="preserve"> we should observe that nothing changes for live tuples. Their </w:t>
+      </w:r>
+      <w:r>
+        <w:rPr>
+          <w:rFonts w:ascii="Courier New" w:eastAsia="Times New Roman" w:hAnsi="Courier New" w:cs="Courier New"/>
+          <w:sz w:val="20"/>
+          <w:szCs w:val="20"/>
+          <w:lang w:val="en-GB" w:eastAsia="ru-RU"/>
+        </w:rPr>
+        <w:t>t_xmin</w:t>
+      </w:r>
+      <w:r>
+        <w:rPr>
+          <w:rFonts w:ascii="Times New Roman" w:eastAsia="Times New Roman" w:hAnsi="Times New Roman" w:cs="Times New Roman"/>
+          <w:sz w:val="24"/>
+          <w:szCs w:val="24"/>
+          <w:lang w:val="en-GB" w:eastAsia="ru-RU"/>
+        </w:rPr>
+        <w:t xml:space="preserve">, </w:t>
+      </w:r>
+      <w:r>
+        <w:rPr>
+          <w:rFonts w:ascii="Courier New" w:eastAsia="Times New Roman" w:hAnsi="Courier New" w:cs="Courier New"/>
+          <w:sz w:val="20"/>
+          <w:szCs w:val="20"/>
+          <w:lang w:val="en-GB" w:eastAsia="ru-RU"/>
+        </w:rPr>
+        <w:t>t_xmax</w:t>
+      </w:r>
+      <w:r>
+        <w:rPr>
+          <w:rFonts w:ascii="Times New Roman" w:eastAsia="Times New Roman" w:hAnsi="Times New Roman" w:cs="Times New Roman"/>
+          <w:sz w:val="24"/>
+          <w:szCs w:val="24"/>
+          <w:lang w:val="en-GB" w:eastAsia="ru-RU"/>
+        </w:rPr>
+        <w:t xml:space="preserve">, and </w:t>
+      </w:r>
+      <w:r>
+        <w:rPr>
+          <w:rFonts w:ascii="Courier New" w:eastAsia="Times New Roman" w:hAnsi="Courier New" w:cs="Courier New"/>
+          <w:sz w:val="20"/>
+          <w:szCs w:val="20"/>
+          <w:lang w:val="en-GB" w:eastAsia="ru-RU"/>
+        </w:rPr>
+        <w:t>t_ctid</w:t>
+      </w:r>
+      <w:r>
+        <w:rPr>
+          <w:rFonts w:ascii="Times New Roman" w:eastAsia="Times New Roman" w:hAnsi="Times New Roman" w:cs="Times New Roman"/>
+          <w:sz w:val="24"/>
+          <w:szCs w:val="24"/>
+          <w:lang w:val="en-GB" w:eastAsia="ru-RU"/>
+        </w:rPr>
+        <w:t xml:space="preserve"> remain the same. Regular </w:t>
+      </w:r>
+      <w:r>
+        <w:rPr>
+          <w:rFonts w:ascii="Courier New" w:eastAsia="Times New Roman" w:hAnsi="Courier New" w:cs="Courier New"/>
+          <w:sz w:val="20"/>
+          <w:szCs w:val="20"/>
+          <w:lang w:val="en-GB" w:eastAsia="ru-RU"/>
         </w:rPr>
         <w:t>VACUUM</w:t>
       </w:r>
       <w:r>
         <w:rPr>
-          <w:lang w:val="en-GB"/>
-        </w:rPr>
-        <w:t xml:space="preserve"> and </w:t>
-      </w:r>
-      <w:r>
-        <w:rPr>
-          <w:rStyle w:val="HTML"/>
-          <w:lang w:val="en-GB"/>
+          <w:rFonts w:ascii="Times New Roman" w:eastAsia="Times New Roman" w:hAnsi="Times New Roman" w:cs="Times New Roman"/>
+          <w:sz w:val="24"/>
+          <w:szCs w:val="24"/>
+          <w:lang w:val="en-GB" w:eastAsia="ru-RU"/>
+        </w:rPr>
+        <w:t xml:space="preserve"> only removes dead tuples and marks their space as reusable, but it does not physically reorganize or rewrite the table. Therefore, tuple positions stay unchanged.</w:t>
+      </w:r>
+    </w:p>
+    <w:p>
+      <w:pPr>
+        <w:spacing w:before="100" w:beforeAutospacing="1" w:after="100" w:afterAutospacing="1" w:line="240" w:lineRule="auto"/>
+        <w:rPr>
+          <w:rFonts w:ascii="Times New Roman" w:eastAsia="Times New Roman" w:hAnsi="Times New Roman" w:cs="Times New Roman"/>
+          <w:sz w:val="24"/>
+          <w:szCs w:val="24"/>
+          <w:lang w:val="en-GB" w:eastAsia="ru-RU"/>
+        </w:rPr>
+      </w:pPr>
+      <w:r>
+        <w:rPr>
+          <w:rFonts w:ascii="Times New Roman" w:eastAsia="Times New Roman" w:hAnsi="Times New Roman" w:cs="Times New Roman"/>
+          <w:sz w:val="24"/>
+          <w:szCs w:val="24"/>
+          <w:lang w:val="en-GB" w:eastAsia="ru-RU"/>
+        </w:rPr>
+        <w:t xml:space="preserve">When we execute </w:t>
+      </w:r>
+      <w:r>
+        <w:rPr>
+          <w:rFonts w:ascii="Courier New" w:eastAsia="Times New Roman" w:hAnsi="Courier New" w:cs="Courier New"/>
+          <w:sz w:val="20"/>
+          <w:szCs w:val="20"/>
+          <w:lang w:val="en-GB" w:eastAsia="ru-RU"/>
+        </w:rPr>
+        <w:t>INSERT INTO person VALUES (5, 'Sarah')</w:t>
+      </w:r>
+      <w:proofErr w:type="gramStart"/>
+      <w:r>
+        <w:rPr>
+          <w:rFonts w:ascii="Courier New" w:eastAsia="Times New Roman" w:hAnsi="Courier New" w:cs="Courier New"/>
+          <w:sz w:val="20"/>
+          <w:szCs w:val="20"/>
+          <w:lang w:val="en-GB" w:eastAsia="ru-RU"/>
+        </w:rPr>
+        <w:t>;</w:t>
+      </w:r>
+      <w:r>
+        <w:rPr>
+          <w:rFonts w:ascii="Times New Roman" w:eastAsia="Times New Roman" w:hAnsi="Times New Roman" w:cs="Times New Roman"/>
+          <w:sz w:val="24"/>
+          <w:szCs w:val="24"/>
+          <w:lang w:val="en-GB" w:eastAsia="ru-RU"/>
+        </w:rPr>
+        <w:t>,</w:t>
+      </w:r>
+      <w:proofErr w:type="gramEnd"/>
+      <w:r>
+        <w:rPr>
+          <w:rFonts w:ascii="Times New Roman" w:eastAsia="Times New Roman" w:hAnsi="Times New Roman" w:cs="Times New Roman"/>
+          <w:sz w:val="24"/>
+          <w:szCs w:val="24"/>
+          <w:lang w:val="en-GB" w:eastAsia="ru-RU"/>
+        </w:rPr>
+        <w:t xml:space="preserve"> a new tuple is created. In the page inspection output, we will see an additional row with a new </w:t>
+      </w:r>
+      <w:r>
+        <w:rPr>
+          <w:rFonts w:ascii="Courier New" w:eastAsia="Times New Roman" w:hAnsi="Courier New" w:cs="Courier New"/>
+          <w:sz w:val="20"/>
+          <w:szCs w:val="20"/>
+          <w:lang w:val="en-GB" w:eastAsia="ru-RU"/>
+        </w:rPr>
+        <w:t>t_xmin</w:t>
+      </w:r>
+      <w:r>
+        <w:rPr>
+          <w:rFonts w:ascii="Times New Roman" w:eastAsia="Times New Roman" w:hAnsi="Times New Roman" w:cs="Times New Roman"/>
+          <w:sz w:val="24"/>
+          <w:szCs w:val="24"/>
+          <w:lang w:val="en-GB" w:eastAsia="ru-RU"/>
+        </w:rPr>
+        <w:t xml:space="preserve"> corresponding to the current transaction, </w:t>
+      </w:r>
+      <w:r>
+        <w:rPr>
+          <w:rFonts w:ascii="Courier New" w:eastAsia="Times New Roman" w:hAnsi="Courier New" w:cs="Courier New"/>
+          <w:sz w:val="20"/>
+          <w:szCs w:val="20"/>
+          <w:lang w:val="en-GB" w:eastAsia="ru-RU"/>
+        </w:rPr>
+        <w:t xml:space="preserve">t_xmax = </w:t>
+      </w:r>
+      <w:proofErr w:type="gramStart"/>
+      <w:r>
+        <w:rPr>
+          <w:rFonts w:ascii="Courier New" w:eastAsia="Times New Roman" w:hAnsi="Courier New" w:cs="Courier New"/>
+          <w:sz w:val="20"/>
+          <w:szCs w:val="20"/>
+          <w:lang w:val="en-GB" w:eastAsia="ru-RU"/>
+        </w:rPr>
+        <w:t>0</w:t>
+      </w:r>
+      <w:proofErr w:type="gramEnd"/>
+      <w:r>
+        <w:rPr>
+          <w:rFonts w:ascii="Times New Roman" w:eastAsia="Times New Roman" w:hAnsi="Times New Roman" w:cs="Times New Roman"/>
+          <w:sz w:val="24"/>
+          <w:szCs w:val="24"/>
+          <w:lang w:val="en-GB" w:eastAsia="ru-RU"/>
+        </w:rPr>
+        <w:t xml:space="preserve"> (meaning the row is alive), and a new </w:t>
+      </w:r>
+      <w:r>
+        <w:rPr>
+          <w:rFonts w:ascii="Courier New" w:eastAsia="Times New Roman" w:hAnsi="Courier New" w:cs="Courier New"/>
+          <w:sz w:val="20"/>
+          <w:szCs w:val="20"/>
+          <w:lang w:val="en-GB" w:eastAsia="ru-RU"/>
+        </w:rPr>
+        <w:t>t_ctid</w:t>
+      </w:r>
+      <w:r>
+        <w:rPr>
+          <w:rFonts w:ascii="Times New Roman" w:eastAsia="Times New Roman" w:hAnsi="Times New Roman" w:cs="Times New Roman"/>
+          <w:sz w:val="24"/>
+          <w:szCs w:val="24"/>
+          <w:lang w:val="en-GB" w:eastAsia="ru-RU"/>
+        </w:rPr>
+        <w:t xml:space="preserve"> showing its physical position on the page.</w:t>
+      </w:r>
+    </w:p>
+    <w:p>
+      <w:pPr>
+        <w:spacing w:before="100" w:beforeAutospacing="1" w:after="100" w:afterAutospacing="1" w:line="240" w:lineRule="auto"/>
+        <w:rPr>
+          <w:rFonts w:ascii="Times New Roman" w:eastAsia="Times New Roman" w:hAnsi="Times New Roman" w:cs="Times New Roman"/>
+          <w:sz w:val="24"/>
+          <w:szCs w:val="24"/>
+          <w:lang w:val="en-GB" w:eastAsia="ru-RU"/>
+        </w:rPr>
+      </w:pPr>
+      <w:r>
+        <w:rPr>
+          <w:rFonts w:ascii="Times New Roman" w:eastAsia="Times New Roman" w:hAnsi="Times New Roman" w:cs="Times New Roman"/>
+          <w:sz w:val="24"/>
+          <w:szCs w:val="24"/>
+          <w:lang w:val="en-GB" w:eastAsia="ru-RU"/>
+        </w:rPr>
+        <w:t xml:space="preserve">Finally, after running </w:t>
+      </w:r>
+      <w:r>
+        <w:rPr>
+          <w:rFonts w:ascii="Courier New" w:eastAsia="Times New Roman" w:hAnsi="Courier New" w:cs="Courier New"/>
+          <w:sz w:val="20"/>
+          <w:szCs w:val="20"/>
+          <w:lang w:val="en-GB" w:eastAsia="ru-RU"/>
+        </w:rPr>
+        <w:t>VACUUM FULL labs.person</w:t>
+      </w:r>
+      <w:proofErr w:type="gramStart"/>
+      <w:r>
+        <w:rPr>
+          <w:rFonts w:ascii="Courier New" w:eastAsia="Times New Roman" w:hAnsi="Courier New" w:cs="Courier New"/>
+          <w:sz w:val="20"/>
+          <w:szCs w:val="20"/>
+          <w:lang w:val="en-GB" w:eastAsia="ru-RU"/>
+        </w:rPr>
+        <w:t>;</w:t>
+      </w:r>
+      <w:r>
+        <w:rPr>
+          <w:rFonts w:ascii="Times New Roman" w:eastAsia="Times New Roman" w:hAnsi="Times New Roman" w:cs="Times New Roman"/>
+          <w:sz w:val="24"/>
+          <w:szCs w:val="24"/>
+          <w:lang w:val="en-GB" w:eastAsia="ru-RU"/>
+        </w:rPr>
+        <w:t>,</w:t>
+      </w:r>
+      <w:proofErr w:type="gramEnd"/>
+      <w:r>
+        <w:rPr>
+          <w:rFonts w:ascii="Times New Roman" w:eastAsia="Times New Roman" w:hAnsi="Times New Roman" w:cs="Times New Roman"/>
+          <w:sz w:val="24"/>
+          <w:szCs w:val="24"/>
+          <w:lang w:val="en-GB" w:eastAsia="ru-RU"/>
+        </w:rPr>
+        <w:t xml:space="preserve"> the table is completely rewritten. This compacts the data and removes unused space. As a result, all tuples receive new physical locations, and their </w:t>
+      </w:r>
+      <w:r>
+        <w:rPr>
+          <w:rFonts w:ascii="Courier New" w:eastAsia="Times New Roman" w:hAnsi="Courier New" w:cs="Courier New"/>
+          <w:sz w:val="20"/>
+          <w:szCs w:val="20"/>
+          <w:lang w:val="en-GB" w:eastAsia="ru-RU"/>
+        </w:rPr>
+        <w:t>t_ctid</w:t>
+      </w:r>
+      <w:r>
+        <w:rPr>
+          <w:rFonts w:ascii="Times New Roman" w:eastAsia="Times New Roman" w:hAnsi="Times New Roman" w:cs="Times New Roman"/>
+          <w:sz w:val="24"/>
+          <w:szCs w:val="24"/>
+          <w:lang w:val="en-GB" w:eastAsia="ru-RU"/>
+        </w:rPr>
+        <w:t xml:space="preserve"> values change. This demonstrates the key difference between </w:t>
+      </w:r>
+      <w:r>
+        <w:rPr>
+          <w:rFonts w:ascii="Courier New" w:eastAsia="Times New Roman" w:hAnsi="Courier New" w:cs="Courier New"/>
+          <w:sz w:val="20"/>
+          <w:szCs w:val="20"/>
+          <w:lang w:val="en-GB" w:eastAsia="ru-RU"/>
+        </w:rPr>
+        <w:t>VACUUM</w:t>
+      </w:r>
+      <w:r>
+        <w:rPr>
+          <w:rFonts w:ascii="Times New Roman" w:eastAsia="Times New Roman" w:hAnsi="Times New Roman" w:cs="Times New Roman"/>
+          <w:sz w:val="24"/>
+          <w:szCs w:val="24"/>
+          <w:lang w:val="en-GB" w:eastAsia="ru-RU"/>
+        </w:rPr>
+        <w:t xml:space="preserve"> (logical cleanup only) and </w:t>
+      </w:r>
+      <w:r>
+        <w:rPr>
+          <w:rFonts w:ascii="Courier New" w:eastAsia="Times New Roman" w:hAnsi="Courier New" w:cs="Courier New"/>
+          <w:sz w:val="20"/>
+          <w:szCs w:val="20"/>
+          <w:lang w:val="en-GB" w:eastAsia="ru-RU"/>
         </w:rPr>
         <w:t>VACUUM FULL</w:t>
       </w:r>
       <w:r>
         <w:rPr>
-          <w:lang w:val="en-GB"/>
-        </w:rPr>
-        <w:t xml:space="preserve">. Standard </w:t>
-      </w:r>
-      <w:r>
-        <w:rPr>
-          <w:rStyle w:val="HTML"/>
-          <w:lang w:val="en-GB"/>
-        </w:rPr>
-        <w:t>VACUUM</w:t>
-      </w:r>
-      <w:r>
-        <w:rPr>
-          <w:lang w:val="en-GB"/>
-        </w:rPr>
-        <w:t xml:space="preserve"> marks dead </w:t>
-      </w:r>
-      <w:proofErr w:type="gramStart"/>
-      <w:r>
-        <w:rPr>
-          <w:lang w:val="en-GB"/>
-        </w:rPr>
-        <w:t>tuples</w:t>
-      </w:r>
-      <w:proofErr w:type="gramEnd"/>
-      <w:r>
-        <w:rPr>
-          <w:lang w:val="en-GB"/>
-        </w:rPr>
-        <w:t xml:space="preserve"> as reusable but does not physically remove them from data pages. New INSERT operations can reuse this freed space. </w:t>
-      </w:r>
-      <w:r>
-        <w:rPr>
-          <w:rStyle w:val="HTML"/>
-          <w:lang w:val="en-GB"/>
-        </w:rPr>
-        <w:t>VACUUM FULL</w:t>
-      </w:r>
-      <w:r>
-        <w:rPr>
-          <w:lang w:val="en-GB"/>
-        </w:rPr>
-        <w:t xml:space="preserve"> rewrites the entire table, removes all dead tuples, compacts storage, and changes physical row locations (</w:t>
-      </w:r>
-      <w:r>
-        <w:rPr>
-          <w:rStyle w:val="HTML"/>
-          <w:lang w:val="en-GB"/>
-        </w:rPr>
-        <w:t>ctid</w:t>
-      </w:r>
-      <w:r>
-        <w:rPr>
-          <w:lang w:val="en-GB"/>
-        </w:rPr>
-        <w:t>).</w:t>
+          <w:rFonts w:ascii="Times New Roman" w:eastAsia="Times New Roman" w:hAnsi="Times New Roman" w:cs="Times New Roman"/>
+          <w:sz w:val="24"/>
+          <w:szCs w:val="24"/>
+          <w:lang w:val="en-GB" w:eastAsia="ru-RU"/>
+        </w:rPr>
+        <w:t xml:space="preserve"> (physical reorganization and compaction of the table).</w:t>
       </w:r>
     </w:p>
     <w:p>

</xml_diff>